<commit_message>
Create Java Spring - DB comunication
</commit_message>
<xml_diff>
--- a/4_Diari/Diario.docx
+++ b/4_Diari/Diario.docx
@@ -939,13 +939,7 @@
               <w:rPr>
                 <w:rFonts w:ascii="Arial" w:hAnsi="Arial" w:cs="Arial"/>
               </w:rPr>
-              <w:t>Creazione del</w:t>
-            </w:r>
-            <w:r>
-              <w:rPr>
-                <w:rFonts w:ascii="Arial" w:hAnsi="Arial" w:cs="Arial"/>
-              </w:rPr>
-              <w:t xml:space="preserve"> diagramma E-R database e Wireframe</w:t>
+              <w:t>Creazione del diagramma E-R database e Wireframe</w:t>
             </w:r>
             <w:r>
               <w:rPr>
@@ -1181,6 +1175,362 @@
                 <w:rFonts w:ascii="Arial" w:hAnsi="Arial" w:cs="Arial"/>
               </w:rPr>
               <w:t>AI</w:t>
+            </w:r>
+          </w:p>
+        </w:tc>
+      </w:tr>
+    </w:tbl>
+    <w:p>
+      <w:pPr>
+        <w:rPr>
+          <w:rFonts w:ascii="Arial" w:hAnsi="Arial" w:cs="Arial"/>
+        </w:rPr>
+      </w:pPr>
+    </w:p>
+    <w:tbl>
+      <w:tblPr>
+        <w:tblStyle w:val="Grigliatabella"/>
+        <w:tblW w:w="9634" w:type="dxa"/>
+        <w:tblLook w:val="04A0" w:firstRow="1" w:lastRow="0" w:firstColumn="1" w:lastColumn="0" w:noHBand="0" w:noVBand="1"/>
+      </w:tblPr>
+      <w:tblGrid>
+        <w:gridCol w:w="4803"/>
+        <w:gridCol w:w="4831"/>
+      </w:tblGrid>
+      <w:tr>
+        <w:trPr>
+          <w:trHeight w:hRule="exact" w:val="397"/>
+        </w:trPr>
+        <w:tc>
+          <w:tcPr>
+            <w:tcW w:w="4803" w:type="dxa"/>
+            <w:vAlign w:val="center"/>
+          </w:tcPr>
+          <w:p>
+            <w:pPr>
+              <w:rPr>
+                <w:rFonts w:ascii="Arial" w:hAnsi="Arial" w:cs="Arial"/>
+              </w:rPr>
+            </w:pPr>
+            <w:r>
+              <w:rPr>
+                <w:rFonts w:ascii="Arial" w:hAnsi="Arial" w:cs="Arial"/>
+              </w:rPr>
+              <w:t>Luogo</w:t>
+            </w:r>
+          </w:p>
+        </w:tc>
+        <w:tc>
+          <w:tcPr>
+            <w:tcW w:w="4831" w:type="dxa"/>
+            <w:vAlign w:val="center"/>
+          </w:tcPr>
+          <w:p>
+            <w:pPr>
+              <w:pStyle w:val="Nessunaspaziatura"/>
+              <w:spacing w:line="360" w:lineRule="auto"/>
+              <w:rPr>
+                <w:rFonts w:ascii="Arial" w:hAnsi="Arial" w:cs="Arial"/>
+              </w:rPr>
+            </w:pPr>
+            <w:r>
+              <w:rPr>
+                <w:rFonts w:ascii="Arial" w:hAnsi="Arial" w:cs="Arial"/>
+              </w:rPr>
+              <w:t>Canobbio</w:t>
+            </w:r>
+          </w:p>
+        </w:tc>
+      </w:tr>
+      <w:tr>
+        <w:trPr>
+          <w:trHeight w:hRule="exact" w:val="397"/>
+        </w:trPr>
+        <w:tc>
+          <w:tcPr>
+            <w:tcW w:w="4803" w:type="dxa"/>
+            <w:vAlign w:val="center"/>
+          </w:tcPr>
+          <w:p>
+            <w:pPr>
+              <w:rPr>
+                <w:rFonts w:ascii="Arial" w:hAnsi="Arial" w:cs="Arial"/>
+              </w:rPr>
+            </w:pPr>
+            <w:r>
+              <w:rPr>
+                <w:rFonts w:ascii="Arial" w:hAnsi="Arial" w:cs="Arial"/>
+              </w:rPr>
+              <w:t>Data</w:t>
+            </w:r>
+          </w:p>
+        </w:tc>
+        <w:tc>
+          <w:tcPr>
+            <w:tcW w:w="4831" w:type="dxa"/>
+            <w:vAlign w:val="center"/>
+          </w:tcPr>
+          <w:p>
+            <w:pPr>
+              <w:rPr>
+                <w:rFonts w:ascii="Arial" w:hAnsi="Arial" w:cs="Arial"/>
+              </w:rPr>
+            </w:pPr>
+            <w:r>
+              <w:rPr>
+                <w:rFonts w:ascii="Arial" w:hAnsi="Arial" w:cs="Arial"/>
+              </w:rPr>
+              <w:t>09</w:t>
+            </w:r>
+            <w:r>
+              <w:rPr>
+                <w:rFonts w:ascii="Arial" w:hAnsi="Arial" w:cs="Arial"/>
+              </w:rPr>
+              <w:t>.10</w:t>
+            </w:r>
+            <w:r>
+              <w:rPr>
+                <w:rFonts w:ascii="Arial" w:hAnsi="Arial" w:cs="Arial"/>
+              </w:rPr>
+              <w:t>.</w:t>
+            </w:r>
+            <w:r>
+              <w:rPr>
+                <w:rFonts w:ascii="Arial" w:hAnsi="Arial" w:cs="Arial"/>
+              </w:rPr>
+              <w:t>2026</w:t>
+            </w:r>
+          </w:p>
+        </w:tc>
+      </w:tr>
+    </w:tbl>
+    <w:p>
+      <w:pPr>
+        <w:rPr>
+          <w:rFonts w:ascii="Arial" w:hAnsi="Arial" w:cs="Arial"/>
+        </w:rPr>
+      </w:pPr>
+    </w:p>
+    <w:tbl>
+      <w:tblPr>
+        <w:tblStyle w:val="Grigliatabella"/>
+        <w:tblW w:w="0" w:type="auto"/>
+        <w:tblLook w:val="04A0" w:firstRow="1" w:lastRow="0" w:firstColumn="1" w:lastColumn="0" w:noHBand="0" w:noVBand="1"/>
+      </w:tblPr>
+      <w:tblGrid>
+        <w:gridCol w:w="9628"/>
+      </w:tblGrid>
+      <w:tr>
+        <w:tc>
+          <w:tcPr>
+            <w:tcW w:w="9854" w:type="dxa"/>
+            <w:shd w:val="clear" w:color="auto" w:fill="D9D9D9" w:themeFill="background1" w:themeFillShade="D9"/>
+          </w:tcPr>
+          <w:p>
+            <w:pPr>
+              <w:rPr>
+                <w:rFonts w:ascii="Arial" w:hAnsi="Arial" w:cs="Arial"/>
+              </w:rPr>
+            </w:pPr>
+            <w:r>
+              <w:rPr>
+                <w:rFonts w:ascii="Arial" w:hAnsi="Arial" w:cs="Arial"/>
+              </w:rPr>
+              <w:t>Lavori svolti</w:t>
+            </w:r>
+          </w:p>
+        </w:tc>
+      </w:tr>
+      <w:tr>
+        <w:tc>
+          <w:tcPr>
+            <w:tcW w:w="9854" w:type="dxa"/>
+          </w:tcPr>
+          <w:p>
+            <w:pPr>
+              <w:rPr>
+                <w:rFonts w:ascii="Arial" w:hAnsi="Arial" w:cs="Arial"/>
+              </w:rPr>
+            </w:pPr>
+            <w:r>
+              <w:rPr>
+                <w:rFonts w:ascii="Arial" w:hAnsi="Arial" w:cs="Arial"/>
+              </w:rPr>
+              <w:t>Creazione del</w:t>
+            </w:r>
+            <w:r>
+              <w:rPr>
+                <w:rFonts w:ascii="Arial" w:hAnsi="Arial" w:cs="Arial"/>
+              </w:rPr>
+              <w:t xml:space="preserve"> DB sql e della web App</w:t>
+            </w:r>
+          </w:p>
+        </w:tc>
+      </w:tr>
+    </w:tbl>
+    <w:p>
+      <w:pPr>
+        <w:rPr>
+          <w:rFonts w:ascii="Arial" w:hAnsi="Arial" w:cs="Arial"/>
+        </w:rPr>
+      </w:pPr>
+    </w:p>
+    <w:tbl>
+      <w:tblPr>
+        <w:tblStyle w:val="Grigliatabella"/>
+        <w:tblW w:w="0" w:type="auto"/>
+        <w:tblLook w:val="04A0" w:firstRow="1" w:lastRow="0" w:firstColumn="1" w:lastColumn="0" w:noHBand="0" w:noVBand="1"/>
+      </w:tblPr>
+      <w:tblGrid>
+        <w:gridCol w:w="9628"/>
+      </w:tblGrid>
+      <w:tr>
+        <w:tc>
+          <w:tcPr>
+            <w:tcW w:w="9854" w:type="dxa"/>
+            <w:shd w:val="clear" w:color="auto" w:fill="D9D9D9" w:themeFill="background1" w:themeFillShade="D9"/>
+          </w:tcPr>
+          <w:p>
+            <w:pPr>
+              <w:rPr>
+                <w:rFonts w:ascii="Arial" w:hAnsi="Arial" w:cs="Arial"/>
+              </w:rPr>
+            </w:pPr>
+            <w:r>
+              <w:rPr>
+                <w:rFonts w:ascii="Arial" w:hAnsi="Arial" w:cs="Arial"/>
+              </w:rPr>
+              <w:t>Problemi riscontrati e soluzioni adottate</w:t>
+            </w:r>
+          </w:p>
+        </w:tc>
+      </w:tr>
+      <w:tr>
+        <w:tc>
+          <w:tcPr>
+            <w:tcW w:w="9854" w:type="dxa"/>
+          </w:tcPr>
+          <w:p>
+            <w:pPr>
+              <w:rPr>
+                <w:rFonts w:ascii="Arial" w:hAnsi="Arial" w:cs="Arial"/>
+              </w:rPr>
+            </w:pPr>
+            <w:r>
+              <w:rPr>
+                <w:rFonts w:ascii="Arial" w:hAnsi="Arial" w:cs="Arial"/>
+              </w:rPr>
+              <w:t>Problemi con Apache e connessione al DB per l’accesso</w:t>
+            </w:r>
+          </w:p>
+        </w:tc>
+      </w:tr>
+    </w:tbl>
+    <w:p>
+      <w:pPr>
+        <w:rPr>
+          <w:rFonts w:ascii="Arial" w:hAnsi="Arial" w:cs="Arial"/>
+        </w:rPr>
+      </w:pPr>
+    </w:p>
+    <w:tbl>
+      <w:tblPr>
+        <w:tblStyle w:val="Grigliatabella"/>
+        <w:tblW w:w="0" w:type="auto"/>
+        <w:tblLook w:val="04A0" w:firstRow="1" w:lastRow="0" w:firstColumn="1" w:lastColumn="0" w:noHBand="0" w:noVBand="1"/>
+      </w:tblPr>
+      <w:tblGrid>
+        <w:gridCol w:w="9628"/>
+      </w:tblGrid>
+      <w:tr>
+        <w:tc>
+          <w:tcPr>
+            <w:tcW w:w="9854" w:type="dxa"/>
+            <w:shd w:val="clear" w:color="auto" w:fill="D9D9D9" w:themeFill="background1" w:themeFillShade="D9"/>
+          </w:tcPr>
+          <w:p>
+            <w:pPr>
+              <w:rPr>
+                <w:rFonts w:ascii="Arial" w:hAnsi="Arial" w:cs="Arial"/>
+              </w:rPr>
+            </w:pPr>
+            <w:r>
+              <w:rPr>
+                <w:rFonts w:ascii="Arial" w:hAnsi="Arial" w:cs="Arial"/>
+              </w:rPr>
+              <w:t>Punto della situazione rispetto alla pianificazione</w:t>
+            </w:r>
+          </w:p>
+        </w:tc>
+      </w:tr>
+      <w:tr>
+        <w:tc>
+          <w:tcPr>
+            <w:tcW w:w="9854" w:type="dxa"/>
+          </w:tcPr>
+          <w:p>
+            <w:pPr>
+              <w:rPr>
+                <w:rFonts w:ascii="Arial" w:hAnsi="Arial" w:cs="Arial"/>
+              </w:rPr>
+            </w:pPr>
+          </w:p>
+        </w:tc>
+      </w:tr>
+    </w:tbl>
+    <w:p>
+      <w:pPr>
+        <w:rPr>
+          <w:rFonts w:ascii="Arial" w:hAnsi="Arial" w:cs="Arial"/>
+        </w:rPr>
+      </w:pPr>
+    </w:p>
+    <w:tbl>
+      <w:tblPr>
+        <w:tblStyle w:val="Grigliatabella"/>
+        <w:tblW w:w="0" w:type="auto"/>
+        <w:tblLook w:val="04A0" w:firstRow="1" w:lastRow="0" w:firstColumn="1" w:lastColumn="0" w:noHBand="0" w:noVBand="1"/>
+      </w:tblPr>
+      <w:tblGrid>
+        <w:gridCol w:w="9628"/>
+      </w:tblGrid>
+      <w:tr>
+        <w:tc>
+          <w:tcPr>
+            <w:tcW w:w="9854" w:type="dxa"/>
+            <w:shd w:val="clear" w:color="auto" w:fill="D9D9D9" w:themeFill="background1" w:themeFillShade="D9"/>
+          </w:tcPr>
+          <w:p>
+            <w:pPr>
+              <w:rPr>
+                <w:rFonts w:ascii="Arial" w:hAnsi="Arial" w:cs="Arial"/>
+              </w:rPr>
+            </w:pPr>
+            <w:r>
+              <w:rPr>
+                <w:rFonts w:ascii="Arial" w:hAnsi="Arial" w:cs="Arial"/>
+              </w:rPr>
+              <w:t>Programma di massima per la prossima giornata di lavoro</w:t>
+            </w:r>
+          </w:p>
+        </w:tc>
+      </w:tr>
+      <w:tr>
+        <w:tc>
+          <w:tcPr>
+            <w:tcW w:w="9854" w:type="dxa"/>
+          </w:tcPr>
+          <w:p>
+            <w:pPr>
+              <w:rPr>
+                <w:rFonts w:ascii="Arial" w:hAnsi="Arial" w:cs="Arial"/>
+              </w:rPr>
+            </w:pPr>
+            <w:r>
+              <w:rPr>
+                <w:rFonts w:ascii="Arial" w:hAnsi="Arial" w:cs="Arial"/>
+              </w:rPr>
+              <w:t>~4h</w:t>
             </w:r>
           </w:p>
         </w:tc>
@@ -4115,6 +4465,7 @@
   <w:style w:type="character" w:default="1" w:styleId="Carpredefinitoparagrafo">
     <w:name w:val="Default Paragraph Font"/>
     <w:uiPriority w:val="1"/>
+    <w:semiHidden/>
     <w:unhideWhenUsed/>
   </w:style>
   <w:style w:type="table" w:default="1" w:styleId="Tabellanormale">
@@ -4702,6 +5053,7 @@
     <w:rsid w:val="00262E13"/>
     <w:rsid w:val="002746BC"/>
     <w:rsid w:val="00283BFA"/>
+    <w:rsid w:val="002959F8"/>
     <w:rsid w:val="002A3EDE"/>
     <w:rsid w:val="002E249D"/>
     <w:rsid w:val="00304ECD"/>

</xml_diff>

<commit_message>
Capire perché possiamo accedere a immagini, css e js senza i permessi in security
</commit_message>
<xml_diff>
--- a/4_Diari/Diario.docx
+++ b/4_Diari/Diario.docx
@@ -1280,13 +1280,7 @@
               <w:rPr>
                 <w:rFonts w:ascii="Arial" w:hAnsi="Arial" w:cs="Arial"/>
               </w:rPr>
-              <w:t>09</w:t>
-            </w:r>
-            <w:r>
-              <w:rPr>
-                <w:rFonts w:ascii="Arial" w:hAnsi="Arial" w:cs="Arial"/>
-              </w:rPr>
-              <w:t>.10</w:t>
+              <w:t>09.10</w:t>
             </w:r>
             <w:r>
               <w:rPr>
@@ -1356,13 +1350,7 @@
               <w:rPr>
                 <w:rFonts w:ascii="Arial" w:hAnsi="Arial" w:cs="Arial"/>
               </w:rPr>
-              <w:t>Creazione del</w:t>
-            </w:r>
-            <w:r>
-              <w:rPr>
-                <w:rFonts w:ascii="Arial" w:hAnsi="Arial" w:cs="Arial"/>
-              </w:rPr>
-              <w:t xml:space="preserve"> DB sql e della web App</w:t>
+              <w:t>Creazione del DB sql e della web App</w:t>
             </w:r>
             <w:r>
               <w:rPr>
@@ -1591,6 +1579,380 @@
                 <w:rFonts w:ascii="Arial" w:hAnsi="Arial" w:cs="Arial"/>
               </w:rPr>
               <w:t>h</w:t>
+            </w:r>
+          </w:p>
+        </w:tc>
+      </w:tr>
+    </w:tbl>
+    <w:p>
+      <w:pPr>
+        <w:rPr>
+          <w:rFonts w:ascii="Arial" w:hAnsi="Arial" w:cs="Arial"/>
+        </w:rPr>
+      </w:pPr>
+    </w:p>
+    <w:tbl>
+      <w:tblPr>
+        <w:tblStyle w:val="Grigliatabella"/>
+        <w:tblW w:w="9634" w:type="dxa"/>
+        <w:tblLook w:val="04A0" w:firstRow="1" w:lastRow="0" w:firstColumn="1" w:lastColumn="0" w:noHBand="0" w:noVBand="1"/>
+      </w:tblPr>
+      <w:tblGrid>
+        <w:gridCol w:w="4803"/>
+        <w:gridCol w:w="4831"/>
+      </w:tblGrid>
+      <w:tr>
+        <w:trPr>
+          <w:trHeight w:hRule="exact" w:val="397"/>
+        </w:trPr>
+        <w:tc>
+          <w:tcPr>
+            <w:tcW w:w="4803" w:type="dxa"/>
+            <w:vAlign w:val="center"/>
+          </w:tcPr>
+          <w:p>
+            <w:pPr>
+              <w:rPr>
+                <w:rFonts w:ascii="Arial" w:hAnsi="Arial" w:cs="Arial"/>
+              </w:rPr>
+            </w:pPr>
+            <w:r>
+              <w:rPr>
+                <w:rFonts w:ascii="Arial" w:hAnsi="Arial" w:cs="Arial"/>
+              </w:rPr>
+              <w:t>Luogo</w:t>
+            </w:r>
+          </w:p>
+        </w:tc>
+        <w:tc>
+          <w:tcPr>
+            <w:tcW w:w="4831" w:type="dxa"/>
+            <w:vAlign w:val="center"/>
+          </w:tcPr>
+          <w:p>
+            <w:pPr>
+              <w:pStyle w:val="Nessunaspaziatura"/>
+              <w:spacing w:line="360" w:lineRule="auto"/>
+              <w:rPr>
+                <w:rFonts w:ascii="Arial" w:hAnsi="Arial" w:cs="Arial"/>
+              </w:rPr>
+            </w:pPr>
+            <w:r>
+              <w:rPr>
+                <w:rFonts w:ascii="Arial" w:hAnsi="Arial" w:cs="Arial"/>
+              </w:rPr>
+              <w:t>Canobbio</w:t>
+            </w:r>
+          </w:p>
+        </w:tc>
+      </w:tr>
+      <w:tr>
+        <w:trPr>
+          <w:trHeight w:hRule="exact" w:val="397"/>
+        </w:trPr>
+        <w:tc>
+          <w:tcPr>
+            <w:tcW w:w="4803" w:type="dxa"/>
+            <w:vAlign w:val="center"/>
+          </w:tcPr>
+          <w:p>
+            <w:pPr>
+              <w:rPr>
+                <w:rFonts w:ascii="Arial" w:hAnsi="Arial" w:cs="Arial"/>
+              </w:rPr>
+            </w:pPr>
+            <w:r>
+              <w:rPr>
+                <w:rFonts w:ascii="Arial" w:hAnsi="Arial" w:cs="Arial"/>
+              </w:rPr>
+              <w:t>Data</w:t>
+            </w:r>
+          </w:p>
+        </w:tc>
+        <w:tc>
+          <w:tcPr>
+            <w:tcW w:w="4831" w:type="dxa"/>
+            <w:vAlign w:val="center"/>
+          </w:tcPr>
+          <w:p>
+            <w:pPr>
+              <w:rPr>
+                <w:rFonts w:ascii="Arial" w:hAnsi="Arial" w:cs="Arial"/>
+              </w:rPr>
+            </w:pPr>
+            <w:r>
+              <w:rPr>
+                <w:rFonts w:ascii="Arial" w:hAnsi="Arial" w:cs="Arial"/>
+              </w:rPr>
+              <w:t>16</w:t>
+            </w:r>
+            <w:r>
+              <w:rPr>
+                <w:rFonts w:ascii="Arial" w:hAnsi="Arial" w:cs="Arial"/>
+              </w:rPr>
+              <w:t>.10</w:t>
+            </w:r>
+            <w:r>
+              <w:rPr>
+                <w:rFonts w:ascii="Arial" w:hAnsi="Arial" w:cs="Arial"/>
+              </w:rPr>
+              <w:t>.</w:t>
+            </w:r>
+            <w:r>
+              <w:rPr>
+                <w:rFonts w:ascii="Arial" w:hAnsi="Arial" w:cs="Arial"/>
+              </w:rPr>
+              <w:t>2026</w:t>
+            </w:r>
+          </w:p>
+        </w:tc>
+      </w:tr>
+    </w:tbl>
+    <w:p>
+      <w:pPr>
+        <w:rPr>
+          <w:rFonts w:ascii="Arial" w:hAnsi="Arial" w:cs="Arial"/>
+        </w:rPr>
+      </w:pPr>
+    </w:p>
+    <w:tbl>
+      <w:tblPr>
+        <w:tblStyle w:val="Grigliatabella"/>
+        <w:tblW w:w="0" w:type="auto"/>
+        <w:tblLook w:val="04A0" w:firstRow="1" w:lastRow="0" w:firstColumn="1" w:lastColumn="0" w:noHBand="0" w:noVBand="1"/>
+      </w:tblPr>
+      <w:tblGrid>
+        <w:gridCol w:w="9628"/>
+      </w:tblGrid>
+      <w:tr>
+        <w:tc>
+          <w:tcPr>
+            <w:tcW w:w="9854" w:type="dxa"/>
+            <w:shd w:val="clear" w:color="auto" w:fill="D9D9D9" w:themeFill="background1" w:themeFillShade="D9"/>
+          </w:tcPr>
+          <w:p>
+            <w:pPr>
+              <w:rPr>
+                <w:rFonts w:ascii="Arial" w:hAnsi="Arial" w:cs="Arial"/>
+              </w:rPr>
+            </w:pPr>
+            <w:r>
+              <w:rPr>
+                <w:rFonts w:ascii="Arial" w:hAnsi="Arial" w:cs="Arial"/>
+              </w:rPr>
+              <w:t>Lavori svolti</w:t>
+            </w:r>
+          </w:p>
+        </w:tc>
+      </w:tr>
+      <w:tr>
+        <w:tc>
+          <w:tcPr>
+            <w:tcW w:w="9854" w:type="dxa"/>
+          </w:tcPr>
+          <w:p>
+            <w:pPr>
+              <w:rPr>
+                <w:rFonts w:ascii="Arial" w:hAnsi="Arial" w:cs="Arial"/>
+              </w:rPr>
+            </w:pPr>
+            <w:r>
+              <w:rPr>
+                <w:rFonts w:ascii="Arial" w:hAnsi="Arial" w:cs="Arial"/>
+              </w:rPr>
+              <w:t>Creazione del</w:t>
+            </w:r>
+            <w:r>
+              <w:rPr>
+                <w:rFonts w:ascii="Arial" w:hAnsi="Arial" w:cs="Arial"/>
+              </w:rPr>
+              <w:t>la funzione di sign-up e inizio</w:t>
+            </w:r>
+            <w:r>
+              <w:rPr>
+                <w:rFonts w:ascii="Arial" w:hAnsi="Arial" w:cs="Arial"/>
+              </w:rPr>
+              <w:t xml:space="preserve"> dell’integrazione di TCGdex</w:t>
+            </w:r>
+          </w:p>
+        </w:tc>
+      </w:tr>
+    </w:tbl>
+    <w:p>
+      <w:pPr>
+        <w:rPr>
+          <w:rFonts w:ascii="Arial" w:hAnsi="Arial" w:cs="Arial"/>
+        </w:rPr>
+      </w:pPr>
+    </w:p>
+    <w:tbl>
+      <w:tblPr>
+        <w:tblStyle w:val="Grigliatabella"/>
+        <w:tblW w:w="0" w:type="auto"/>
+        <w:tblLook w:val="04A0" w:firstRow="1" w:lastRow="0" w:firstColumn="1" w:lastColumn="0" w:noHBand="0" w:noVBand="1"/>
+      </w:tblPr>
+      <w:tblGrid>
+        <w:gridCol w:w="9628"/>
+      </w:tblGrid>
+      <w:tr>
+        <w:tc>
+          <w:tcPr>
+            <w:tcW w:w="9854" w:type="dxa"/>
+            <w:shd w:val="clear" w:color="auto" w:fill="D9D9D9" w:themeFill="background1" w:themeFillShade="D9"/>
+          </w:tcPr>
+          <w:p>
+            <w:pPr>
+              <w:rPr>
+                <w:rFonts w:ascii="Arial" w:hAnsi="Arial" w:cs="Arial"/>
+              </w:rPr>
+            </w:pPr>
+            <w:r>
+              <w:rPr>
+                <w:rFonts w:ascii="Arial" w:hAnsi="Arial" w:cs="Arial"/>
+              </w:rPr>
+              <w:t>Problemi riscontrati e soluzioni adottate</w:t>
+            </w:r>
+          </w:p>
+        </w:tc>
+      </w:tr>
+      <w:tr>
+        <w:tc>
+          <w:tcPr>
+            <w:tcW w:w="9854" w:type="dxa"/>
+          </w:tcPr>
+          <w:p>
+            <w:pPr>
+              <w:rPr>
+                <w:rFonts w:ascii="Arial" w:hAnsi="Arial" w:cs="Arial"/>
+              </w:rPr>
+            </w:pPr>
+            <w:r>
+              <w:rPr>
+                <w:rFonts w:ascii="Arial" w:hAnsi="Arial" w:cs="Arial"/>
+              </w:rPr>
+              <w:t>Capire perché possiamo accedere a immagini, css e js senza i permessi in security</w:t>
+            </w:r>
+          </w:p>
+        </w:tc>
+      </w:tr>
+    </w:tbl>
+    <w:p>
+      <w:pPr>
+        <w:rPr>
+          <w:rFonts w:ascii="Arial" w:hAnsi="Arial" w:cs="Arial"/>
+        </w:rPr>
+      </w:pPr>
+    </w:p>
+    <w:tbl>
+      <w:tblPr>
+        <w:tblStyle w:val="Grigliatabella"/>
+        <w:tblW w:w="0" w:type="auto"/>
+        <w:tblLook w:val="04A0" w:firstRow="1" w:lastRow="0" w:firstColumn="1" w:lastColumn="0" w:noHBand="0" w:noVBand="1"/>
+      </w:tblPr>
+      <w:tblGrid>
+        <w:gridCol w:w="9628"/>
+      </w:tblGrid>
+      <w:tr>
+        <w:tc>
+          <w:tcPr>
+            <w:tcW w:w="9854" w:type="dxa"/>
+            <w:shd w:val="clear" w:color="auto" w:fill="D9D9D9" w:themeFill="background1" w:themeFillShade="D9"/>
+          </w:tcPr>
+          <w:p>
+            <w:pPr>
+              <w:rPr>
+                <w:rFonts w:ascii="Arial" w:hAnsi="Arial" w:cs="Arial"/>
+              </w:rPr>
+            </w:pPr>
+            <w:r>
+              <w:rPr>
+                <w:rFonts w:ascii="Arial" w:hAnsi="Arial" w:cs="Arial"/>
+              </w:rPr>
+              <w:t>Punto della situazione rispetto alla pianificazione</w:t>
+            </w:r>
+          </w:p>
+        </w:tc>
+      </w:tr>
+      <w:tr>
+        <w:tc>
+          <w:tcPr>
+            <w:tcW w:w="9854" w:type="dxa"/>
+          </w:tcPr>
+          <w:p>
+            <w:pPr>
+              <w:rPr>
+                <w:rFonts w:ascii="Arial" w:hAnsi="Arial" w:cs="Arial"/>
+              </w:rPr>
+            </w:pPr>
+            <w:r>
+              <w:rPr>
+                <w:rFonts w:ascii="Arial" w:hAnsi="Arial" w:cs="Arial"/>
+              </w:rPr>
+              <w:t>Leggermente indietro</w:t>
+            </w:r>
+          </w:p>
+        </w:tc>
+      </w:tr>
+    </w:tbl>
+    <w:p>
+      <w:pPr>
+        <w:rPr>
+          <w:rFonts w:ascii="Arial" w:hAnsi="Arial" w:cs="Arial"/>
+        </w:rPr>
+      </w:pPr>
+    </w:p>
+    <w:tbl>
+      <w:tblPr>
+        <w:tblStyle w:val="Grigliatabella"/>
+        <w:tblW w:w="0" w:type="auto"/>
+        <w:tblLook w:val="04A0" w:firstRow="1" w:lastRow="0" w:firstColumn="1" w:lastColumn="0" w:noHBand="0" w:noVBand="1"/>
+      </w:tblPr>
+      <w:tblGrid>
+        <w:gridCol w:w="9628"/>
+      </w:tblGrid>
+      <w:tr>
+        <w:tc>
+          <w:tcPr>
+            <w:tcW w:w="9854" w:type="dxa"/>
+            <w:shd w:val="clear" w:color="auto" w:fill="D9D9D9" w:themeFill="background1" w:themeFillShade="D9"/>
+          </w:tcPr>
+          <w:p>
+            <w:pPr>
+              <w:rPr>
+                <w:rFonts w:ascii="Arial" w:hAnsi="Arial" w:cs="Arial"/>
+              </w:rPr>
+            </w:pPr>
+            <w:r>
+              <w:rPr>
+                <w:rFonts w:ascii="Arial" w:hAnsi="Arial" w:cs="Arial"/>
+              </w:rPr>
+              <w:t>Programma di massima per la prossima giornata di lavoro</w:t>
+            </w:r>
+          </w:p>
+        </w:tc>
+      </w:tr>
+      <w:tr>
+        <w:tc>
+          <w:tcPr>
+            <w:tcW w:w="9854" w:type="dxa"/>
+          </w:tcPr>
+          <w:p>
+            <w:pPr>
+              <w:rPr>
+                <w:rFonts w:ascii="Arial" w:hAnsi="Arial" w:cs="Arial"/>
+              </w:rPr>
+            </w:pPr>
+            <w:r>
+              <w:rPr>
+                <w:rFonts w:ascii="Arial" w:hAnsi="Arial" w:cs="Arial"/>
+              </w:rPr>
+              <w:t>Sistemare accesso al db senza utente root</w:t>
+            </w:r>
+            <w:r>
+              <w:rPr>
+                <w:rFonts w:ascii="Arial" w:hAnsi="Arial" w:cs="Arial"/>
+              </w:rPr>
+              <w:t>, sistema problema di accesso</w:t>
             </w:r>
           </w:p>
         </w:tc>
@@ -5170,6 +5532,7 @@
     <w:rsid w:val="00917E6C"/>
     <w:rsid w:val="00923218"/>
     <w:rsid w:val="00925A3A"/>
+    <w:rsid w:val="0095669C"/>
     <w:rsid w:val="0095694A"/>
     <w:rsid w:val="00997E7D"/>
     <w:rsid w:val="009D5B0A"/>

</xml_diff>